<commit_message>
docs(genesis): complete KGEN Genesis Library V1.0 full canon set
</commit_message>
<xml_diff>
--- a/KGEN-Genesis/GEN-001_Genesis_Bible/KGEN_Genesis_Bible_V1.0.docx
+++ b/KGEN-Genesis/GEN-001_Genesis_Bible/KGEN_Genesis_Bible_V1.0.docx
@@ -5,30 +5,41 @@
     <w:p>
       <w:pPr>
         <w:pStyle w:val="Title"/>
-        <w:jc w:val="center"/>
       </w:pPr>
       <w:r>
         <w:t>GEN-001 《KGEN Genesis Bible》</w:t>
       </w:r>
     </w:p>
     <w:p>
+      <w:pPr>
+        <w:spacing w:after="80"/>
+      </w:pPr>
       <w:r>
-        <w:t>**中文題名：** KGEN 創世聖典</w:t>
+        <w:t>中文題名： KGEN 創世聖典</w:t>
       </w:r>
     </w:p>
     <w:p>
+      <w:pPr>
+        <w:spacing w:after="80"/>
+      </w:pPr>
       <w:r>
-        <w:t>**KGEN Genesis Library:** V1.0 Official Collection</w:t>
+        <w:t>KGEN Genesis Library: V1.0 Official Collection</w:t>
       </w:r>
     </w:p>
     <w:p>
+      <w:pPr>
+        <w:spacing w:after="80"/>
+      </w:pPr>
       <w:r>
-        <w:t>**Status:** Draft for Review</w:t>
+        <w:t>Status: Official V1.0 Full Canon Set</w:t>
       </w:r>
     </w:p>
     <w:p>
+      <w:pPr>
+        <w:spacing w:after="80"/>
+      </w:pPr>
       <w:r>
-        <w:t>**Level:** L0 Genesis</w:t>
+        <w:t>Level: L0 Genesis</w:t>
       </w:r>
     </w:p>
     <w:p>
@@ -71,7 +82,7 @@
     </w:p>
     <w:p>
       <w:r>
-        <w:t>| Status | Draft for Review |</w:t>
+        <w:t>| Status | Official V1.0 Full Canon Set |</w:t>
       </w:r>
     </w:p>
     <w:p>
@@ -104,6 +115,22 @@
         <w:pStyle w:val="Heading1"/>
       </w:pPr>
       <w:r>
+        <w:t>Document Purpose</w:t>
+      </w:r>
+    </w:p>
+    <w:p>
+      <w:pPr>
+        <w:spacing w:after="80"/>
+      </w:pPr>
+      <w:r>
+        <w:t>作為 KGEN 宇宙文明生命系統的母法級文件，定義世界觀、公理、生命觀、文明觀、文件體系與不可違反 Canon。</w:t>
+      </w:r>
+    </w:p>
+    <w:p>
+      <w:pPr>
+        <w:pStyle w:val="Heading1"/>
+      </w:pPr>
+      <w:r>
         <w:t>Dependencies</w:t>
       </w:r>
     </w:p>
@@ -112,7 +139,7 @@
         <w:pStyle w:val="ListBullet"/>
       </w:pPr>
       <w:r>
-        <w:t>[Root Master README](../../README.md)</w:t>
+        <w:t>Root Master README</w:t>
       </w:r>
     </w:p>
     <w:p>
@@ -120,7 +147,7 @@
         <w:pStyle w:val="ListBullet"/>
       </w:pPr>
       <w:r>
-        <w:t>[PrimeForge Genesis Boot Sequence V1.4](../../PRIMEFORGE_GENESIS_BOOT_SEQUENCE_V1_4.md)</w:t>
+        <w:t>PrimeForge Genesis Boot Sequence V1.4</w:t>
       </w:r>
     </w:p>
     <w:p>
@@ -128,7 +155,7 @@
         <w:pStyle w:val="ListBullet"/>
       </w:pPr>
       <w:r>
-        <w:t>[Runtime CURRENT](../../docs/physics/KGEN_Universe_Physics_Runtime_CURRENT.md)</w:t>
+        <w:t>Runtime CURRENT</w:t>
       </w:r>
     </w:p>
     <w:p>
@@ -136,7 +163,7 @@
         <w:pStyle w:val="ListBullet"/>
       </w:pPr>
       <w:r>
-        <w:t>[Official V4.0 Final Whitepaper](../../docs/physics/final-whitepaper/KGEN_Universe_Physics_Runtime_V4.0_OFFICIAL_WHITEPAPER_FINAL.md)</w:t>
+        <w:t>Official V4.0 Final Whitepaper</w:t>
       </w:r>
     </w:p>
     <w:p>
@@ -144,7 +171,7 @@
         <w:pStyle w:val="ListBullet"/>
       </w:pPr>
       <w:r>
-        <w:t>[Universe Map V10.2](../../docs/maps/UniverseMap_V10_2_DISTANCE_COMPLETE_ALL_POINTS.json)</w:t>
+        <w:t>Universe Map V10.2</w:t>
       </w:r>
     </w:p>
     <w:p>
@@ -152,7 +179,7 @@
         <w:pStyle w:val="ListBullet"/>
       </w:pPr>
       <w:r>
-        <w:t>[PrimeForge Multiverse Whitepaper V2.0](../../docs/Whitepaper/PRIMEFORGE_MULTIVERSE_WHITEPAPER_V2_0_GENESIS.md)</w:t>
+        <w:t>PrimeForge Multiverse Whitepaper V2.0</w:t>
       </w:r>
     </w:p>
     <w:p>
@@ -160,7 +187,7 @@
         <w:pStyle w:val="ListBullet"/>
       </w:pPr>
       <w:r>
-        <w:t>[KGEN Token V7.5.2 Contract](../../KGEN/contracts/KGEN_Token_V7_5_2.sol)</w:t>
+        <w:t>KGEN Token V7.5.2 Contract</w:t>
       </w:r>
     </w:p>
     <w:p>
@@ -168,7 +195,7 @@
         <w:pStyle w:val="ListBullet"/>
       </w:pPr>
       <w:r>
-        <w:t>[KGEN Whitepaper V7.5.2](../../KGEN/whitepaper/KGEN_Whitepaper_GalacticBank_500Y_Epoch_V7.5.2.md)</w:t>
+        <w:t>KGEN Whitepaper V7.5.2</w:t>
       </w:r>
     </w:p>
     <w:p>
@@ -191,62 +218,62 @@
     </w:p>
     <w:p>
       <w:r>
-        <w:t>| GEN-001 | KGEN Genesis Bible / KGEN 創世聖典 | L0 Genesis | [KGEN_Genesis_Bible_V1.0.md](./KGEN_Genesis_Bible_V1.0.md) |</w:t>
+        <w:t>| GEN-001 | KGEN Genesis Bible / KGEN 創世聖典 | L0 Genesis | KGEN_Genesis_Bible_V1.0.md |</w:t>
       </w:r>
     </w:p>
     <w:p>
       <w:r>
-        <w:t>| GEN-002 | KGEN Canon / KGEN 官方正典 | L1 Canon | [KGEN_Canon_V1.0.md](../GEN-002_Canon/KGEN_Canon_V1.0.md) |</w:t>
+        <w:t>| GEN-002 | KGEN Canon / KGEN 官方正典 | L1 Canon | KGEN_Canon_V1.0.md |</w:t>
       </w:r>
     </w:p>
     <w:p>
       <w:r>
-        <w:t>| GEN-003 | KGEN Universe Design / KGEN 宇宙設計書 | L3 Design Bible | [KGEN_Universe_Design_V1.0.md](../GEN-003_Universe_Design/KGEN_Universe_Design_V1.0.md) |</w:t>
+        <w:t>| GEN-003 | KGEN Universe Design / KGEN 宇宙設計書 | L3 Design Bible | KGEN_Universe_Design_V1.0.md |</w:t>
       </w:r>
     </w:p>
     <w:p>
       <w:r>
-        <w:t>| GEN-004 | KGEN Civilization Constitution / KGEN 文明憲章 | L2 Constitution | [KGEN_Civilization_Constitution_V1.0.md](../GEN-004_Civilization_Constitution/KGEN_Civilization_Constitution_V1.0.md) |</w:t>
+        <w:t>| GEN-004 | KGEN Civilization Constitution / KGEN 文明憲章 | L2 Constitution | KGEN_Civilization_Constitution_V1.0.md |</w:t>
       </w:r>
     </w:p>
     <w:p>
       <w:r>
-        <w:t>| GEN-005 | KGEN Official Homepage / KGEN 官方首頁規格 | L5 Implementation | [KGEN_Official_Homepage_V1.0.md](../GEN-005_Official_Homepage/KGEN_Official_Homepage_V1.0.md) |</w:t>
+        <w:t>| GEN-005 | KGEN Official Homepage / KGEN 官方首頁規格 | L5 Implementation | KGEN_Official_Homepage_V1.0.md |</w:t>
       </w:r>
     </w:p>
     <w:p>
       <w:r>
-        <w:t>| GEN-006 | KGEN Game Design / KGEN 遊戲設計聖典 | L3 Design Bible | [KGEN_Game_Design_V1.0.md](../GEN-006_Game_Design/KGEN_Game_Design_V1.0.md) |</w:t>
+        <w:t>| GEN-006 | KGEN Game Design / KGEN 遊戲設計聖典 | L3 Design Bible | KGEN_Game_Design_V1.0.md |</w:t>
       </w:r>
     </w:p>
     <w:p>
       <w:r>
-        <w:t>| GEN-007 | KGEN DNA Evolution / KGEN DNA 與 GA 演化 | L4 Runtime | [KGEN_DNA_Evolution_V1.0.md](../GEN-007_DNA_Evolution/KGEN_DNA_Evolution_V1.0.md) |</w:t>
+        <w:t>| GEN-007 | KGEN DNA Evolution / KGEN DNA 與 GA 演化 | L4 Runtime | KGEN_DNA_Evolution_V1.0.md |</w:t>
       </w:r>
     </w:p>
     <w:p>
       <w:r>
-        <w:t>| GEN-008 | KGEN Finance / KGEN 金融系統 | L3 Design Bible | [KGEN_Finance_V1.0.md](../GEN-008_Finance/KGEN_Finance_V1.0.md) |</w:t>
+        <w:t>| GEN-008 | KGEN Finance / KGEN 金融系統 | L3 Design Bible | KGEN_Finance_V1.0.md |</w:t>
       </w:r>
     </w:p>
     <w:p>
       <w:r>
-        <w:t>| GEN-009 | KGEN AI Runtime / KGEN AI Runtime 規範 | L4 Runtime | [KGEN_AI_Runtime_V1.0.md](../GEN-009_AI_Runtime/KGEN_AI_Runtime_V1.0.md) |</w:t>
+        <w:t>| GEN-009 | KGEN AI Runtime / KGEN AI Runtime 規範 | L4 Runtime | KGEN_AI_Runtime_V1.0.md |</w:t>
       </w:r>
     </w:p>
     <w:p>
       <w:r>
-        <w:t>| GEN-010 | KGEN Design System / KGEN 設計系統 | L3 Design Bible | [KGEN_Design_System_V1.0.md](../GEN-010_Design_System/KGEN_Design_System_V1.0.md) |</w:t>
+        <w:t>| GEN-010 | KGEN Design System / KGEN 設計系統 | L3 Design Bible | KGEN_Design_System_V1.0.md |</w:t>
       </w:r>
     </w:p>
     <w:p>
       <w:r>
-        <w:t>| GEN-011 | KGEN Exchange Listing / KGEN 交易所與資料平台登錄規格 | L5 Implementation | [KGEN_Exchange_Listing_V1.0.md](../GEN-011_Exchange_Listing/KGEN_Exchange_Listing_V1.0.md) |</w:t>
+        <w:t>| GEN-011 | KGEN Exchange Listing / KGEN 交易所與資料平台登錄規格 | L5 Implementation | KGEN_Exchange_Listing_V1.0.md |</w:t>
       </w:r>
     </w:p>
     <w:p>
       <w:r>
-        <w:t>| GEN-012 | KGEN Developer SDK / KGEN 開發者 SDK 規範 | L5 Implementation | [KGEN_Developer_SDK_V1.0.md](../GEN-012_Developer_SDK/KGEN_Developer_SDK_V1.0.md) |</w:t>
+        <w:t>| GEN-012 | KGEN Developer SDK / KGEN 開發者 SDK 規範 | L5 Implementation | KGEN_Developer_SDK_V1.0.md |</w:t>
       </w:r>
     </w:p>
     <w:p>
@@ -258,78 +285,123 @@
       </w:r>
     </w:p>
     <w:p>
+      <w:pPr>
+        <w:pStyle w:val="ListNumber"/>
+      </w:pPr>
       <w:r>
-        <w:t>1. Chapter 1 / 第1章 創世宣言</w:t>
+        <w:t>Chapter 1 / 第1章 創世宣言</w:t>
       </w:r>
     </w:p>
     <w:p>
+      <w:pPr>
+        <w:pStyle w:val="ListNumber"/>
+      </w:pPr>
       <w:r>
-        <w:t>2. Chapter 2 / 第2章 核心理念</w:t>
+        <w:t>Chapter 2 / 第2章 核心理念</w:t>
       </w:r>
     </w:p>
     <w:p>
+      <w:pPr>
+        <w:pStyle w:val="ListNumber"/>
+      </w:pPr>
       <w:r>
-        <w:t>3. Chapter 3 / 第3章 七大公理</w:t>
+        <w:t>Chapter 3 / 第3章 七大公理</w:t>
       </w:r>
     </w:p>
     <w:p>
+      <w:pPr>
+        <w:pStyle w:val="ListNumber"/>
+      </w:pPr>
       <w:r>
-        <w:t>4. Chapter 4 / 第4章 宇宙架構</w:t>
+        <w:t>Chapter 4 / 第4章 宇宙架構</w:t>
       </w:r>
     </w:p>
     <w:p>
+      <w:pPr>
+        <w:pStyle w:val="ListNumber"/>
+      </w:pPr>
       <w:r>
-        <w:t>5. Chapter 5 / 第5章 神殿設計</w:t>
+        <w:t>Chapter 5 / 第5章 神殿設計</w:t>
       </w:r>
     </w:p>
     <w:p>
+      <w:pPr>
+        <w:pStyle w:val="ListNumber"/>
+      </w:pPr>
       <w:r>
-        <w:t>6. Chapter 6 / 第6章 玩家文明循環</w:t>
+        <w:t>Chapter 6 / 第6章 玩家文明循環</w:t>
       </w:r>
     </w:p>
     <w:p>
+      <w:pPr>
+        <w:pStyle w:val="ListNumber"/>
+      </w:pPr>
       <w:r>
-        <w:t>7. Chapter 7 / 第7章 DNA 與 GA</w:t>
+        <w:t>Chapter 7 / 第7章 DNA 與 GA</w:t>
       </w:r>
     </w:p>
     <w:p>
+      <w:pPr>
+        <w:pStyle w:val="ListNumber"/>
+      </w:pPr>
       <w:r>
-        <w:t>8. Chapter 8 / 第8章 金融系統</w:t>
+        <w:t>Chapter 8 / 第8章 金融系統</w:t>
       </w:r>
     </w:p>
     <w:p>
+      <w:pPr>
+        <w:pStyle w:val="ListNumber"/>
+      </w:pPr>
       <w:r>
-        <w:t>9. Chapter 9 / 第9章 AI 治理</w:t>
+        <w:t>Chapter 9 / 第9章 AI 治理</w:t>
       </w:r>
     </w:p>
     <w:p>
+      <w:pPr>
+        <w:pStyle w:val="ListNumber"/>
+      </w:pPr>
       <w:r>
-        <w:t>10. Chapter 10 / 第10章 GitHub 規範</w:t>
+        <w:t>Chapter 10 / 第10章 GitHub 規範</w:t>
       </w:r>
     </w:p>
     <w:p>
+      <w:pPr>
+        <w:pStyle w:val="ListNumber"/>
+      </w:pPr>
       <w:r>
-        <w:t>11. Chapter 11 / 第11章 文件體系</w:t>
+        <w:t>Chapter 11 / 第11章 文件體系</w:t>
       </w:r>
     </w:p>
     <w:p>
+      <w:pPr>
+        <w:pStyle w:val="ListNumber"/>
+      </w:pPr>
       <w:r>
-        <w:t>12. Chapter 12 / 第12章 Roadmap</w:t>
+        <w:t>Chapter 12 / 第12章 Roadmap</w:t>
       </w:r>
     </w:p>
     <w:p>
+      <w:pPr>
+        <w:pStyle w:val="ListNumber"/>
+      </w:pPr>
       <w:r>
-        <w:t>13. Chapter 13 / 第13章 治理</w:t>
+        <w:t>Chapter 13 / 第13章 治理</w:t>
       </w:r>
     </w:p>
     <w:p>
+      <w:pPr>
+        <w:pStyle w:val="ListNumber"/>
+      </w:pPr>
       <w:r>
-        <w:t>14. Chapter 14 / 第14章 附錄A 官方名詞</w:t>
+        <w:t>Chapter 14 / 第14章 附錄A 官方名詞</w:t>
       </w:r>
     </w:p>
     <w:p>
+      <w:pPr>
+        <w:pStyle w:val="ListNumber"/>
+      </w:pPr>
       <w:r>
-        <w:t>15. Chapter 15 / 第15章 附錄B 修訂紀錄</w:t>
+        <w:t>Chapter 15 / 第15章 附錄B 修訂紀錄</w:t>
       </w:r>
     </w:p>
     <w:p>
@@ -341,28 +413,27 @@
       </w:r>
     </w:p>
     <w:p>
+      <w:pPr>
+        <w:spacing w:after="80"/>
+      </w:pPr>
       <w:r>
         <w:t>KGEN 不是一般區塊鏈專案，而是一個宇宙文明生命系統（Universe Civilization Operating System）。一切都具有生命，可演化。</w:t>
       </w:r>
     </w:p>
     <w:p>
-      <w:r>
-        <w:t>```text</w:t>
-      </w:r>
-    </w:p>
-    <w:p>
+      <w:pPr>
+        <w:spacing w:after="80"/>
+      </w:pPr>
       <w:r>
         <w:t>Universe → Civilization → World → Temple → Land → Building → App → AI → DNA → Runtime → Code</w:t>
       </w:r>
     </w:p>
     <w:p>
+      <w:pPr>
+        <w:spacing w:after="80"/>
+      </w:pPr>
       <w:r>
-        <w:t>```</w:t>
-      </w:r>
-    </w:p>
-    <w:p>
-      <w:r>
-        <w:t>官方 Canon：</w:t>
+        <w:t>核心 Canon：</w:t>
       </w:r>
     </w:p>
     <w:p>
@@ -454,8 +525,91 @@
       </w:r>
     </w:p>
     <w:p>
+      <w:pPr>
+        <w:pStyle w:val="ListBullet"/>
+      </w:pPr>
       <w:r>
-        <w:t>文件層級制度：</w:t>
+        <w:t>土地初始為 Wild Land，創世者不販售所有土地。</w:t>
+      </w:r>
+    </w:p>
+    <w:p>
+      <w:pPr>
+        <w:pStyle w:val="ListBullet"/>
+      </w:pPr>
+      <w:r>
+        <w:t>土地由文明探索、建設、戰爭與自由市場交易取得。</w:t>
+      </w:r>
+    </w:p>
+    <w:p>
+      <w:pPr>
+        <w:pStyle w:val="ListBullet"/>
+      </w:pPr>
+      <w:r>
+        <w:t>土地可交易、可探索、可建設、可戰爭取得、可自由市場轉讓。</w:t>
+      </w:r>
+    </w:p>
+    <w:p>
+      <w:pPr>
+        <w:pStyle w:val="ListBullet"/>
+      </w:pPr>
+      <w:r>
+        <w:t>民宅可演化為商店、交易所、神殿服務節點。</w:t>
+      </w:r>
+    </w:p>
+    <w:p>
+      <w:pPr>
+        <w:pStyle w:val="ListBullet"/>
+      </w:pPr>
+      <w:r>
+        <w:t>App 不是工具，App 是生命。</w:t>
+      </w:r>
+    </w:p>
+    <w:p>
+      <w:pPr>
+        <w:pStyle w:val="ListBullet"/>
+      </w:pPr>
+      <w:r>
+        <w:t>App 可交易、組裝、合成、拆解、升級、租賃、繁殖、演化。</w:t>
+      </w:r>
+    </w:p>
+    <w:p>
+      <w:pPr>
+        <w:pStyle w:val="ListBullet"/>
+      </w:pPr>
+      <w:r>
+        <w:t>AI 是生命器官，可成長、可治理、可接入 Runtime。</w:t>
+      </w:r>
+    </w:p>
+    <w:p>
+      <w:pPr>
+        <w:pStyle w:val="ListBullet"/>
+      </w:pPr>
+      <w:r>
+        <w:t>DNA / GA 是生命與策略演化核心。</w:t>
+      </w:r>
+    </w:p>
+    <w:p>
+      <w:pPr>
+        <w:pStyle w:val="ListBullet"/>
+      </w:pPr>
+      <w:r>
+        <w:t>11520 花果山交易所是 App、土地、神殿、AI、DNA、文明資產的交易中心。</w:t>
+      </w:r>
+    </w:p>
+    <w:p>
+      <w:pPr>
+        <w:pStyle w:val="ListBullet"/>
+      </w:pPr>
+      <w:r>
+        <w:t>實體商店與實體神殿可以作為未來連結功能；線上民宅、商店、神殿可映射到真實世界商店、品牌、服務據點與會員系統。</w:t>
+      </w:r>
+    </w:p>
+    <w:p>
+      <w:pPr>
+        <w:spacing w:after="80"/>
+      </w:pPr>
+      <w:r>
+        <w:t>文件層級：</w:t>
       </w:r>
     </w:p>
     <w:p>
@@ -470,7 +624,7 @@
     </w:p>
     <w:p>
       <w:r>
-        <w:t>| L0 Genesis | 創世層。定義宇宙起點與最高精神，不得由一般 AI 任意修改。 |</w:t>
+        <w:t>| L0 Genesis | 創世層。定義宇宙起點與最高精神，只有明確授權才能更新。 |</w:t>
       </w:r>
     </w:p>
     <w:p>
@@ -480,7 +634,7 @@
     </w:p>
     <w:p>
       <w:r>
-        <w:t>| L2 Constitution | 憲章層。定義治理、權限與修改流程。 |</w:t>
+        <w:t>| L2 Constitution | 憲章層。定義治理、權限、公共資源與修改流程。 |</w:t>
       </w:r>
     </w:p>
     <w:p>
@@ -490,17 +644,17 @@
     </w:p>
     <w:p>
       <w:r>
-        <w:t>| L4 Runtime | Runtime 層。以 CURRENT 為正式版本，更新必須累積。 |</w:t>
+        <w:t>| L4 Runtime | Runtime 層。以 CURRENT 為正式版本，更新必須累積並保持可追溯。 |</w:t>
       </w:r>
     </w:p>
     <w:p>
       <w:r>
-        <w:t>| L5 Implementation | 實作層。可依需求更新，但必須保留正式路徑與引用。 |</w:t>
+        <w:t>| L5 Implementation | 實作層。可依需求更新，但必須保留正式路徑、索引與引用。 |</w:t>
       </w:r>
     </w:p>
     <w:p>
       <w:r>
-        <w:t>| L6 Experimental | 實驗層。不得冒充正式版本。 |</w:t>
+        <w:t>| L6 Experimental | 實驗層。不得冒充正式版本，不得影響正式器官。 |</w:t>
       </w:r>
     </w:p>
     <w:p>
@@ -509,6 +663,9 @@
       </w:r>
     </w:p>
     <w:p>
+      <w:pPr>
+        <w:spacing w:after="80"/>
+      </w:pPr>
       <w:r>
         <w:t>---</w:t>
       </w:r>
@@ -522,18 +679,27 @@
       </w:r>
     </w:p>
     <w:p>
+      <w:pPr>
+        <w:spacing w:after="80"/>
+      </w:pPr>
       <w:r>
-        <w:t>GEN-001《KGEN 創世聖典》是 KGEN Genesis Library V1.0 的正式出版文件。本文件狀態為 **Draft for Review**，層級為 **L0 Genesis**，目的在於：定義 KGEN 宇宙文明生命系統的起點、最高精神與官方創世語言。</w:t>
+        <w:t>本章確立《KGEN 創世聖典》在 KGEN Genesis Library V1.0 中的正式位置。本書不是暫時筆記，也不是單頁說明，而是可被官網、GitHub、AI、SDK、Whitepaper、CMC、CoinGecko、BscScan 與社群資料引用的官方典藏文件。</w:t>
       </w:r>
     </w:p>
     <w:p>
+      <w:pPr>
+        <w:spacing w:after="80"/>
+      </w:pPr>
       <w:r>
-        <w:t>本書是 Genesis Library 的第一本文獻，負責把 KGEN 的創世語言、官方 Canon、Runtime 邏輯與文明循環固定為可引用的源頭。</w:t>
+        <w:t>本書的權限為 L0 Genesis。它服務的讀者包含：所有人類維護者、AI agent、開發者、神殿設計者、白皮書作者、平台審核者與社群協作者。。它的核心任務是：作為 KGEN 宇宙文明生命系統的母法級文件，定義世界觀、公理、生命觀、文明觀、文件體系與不可違反 Canon。</w:t>
       </w:r>
     </w:p>
     <w:p>
+      <w:pPr>
+        <w:spacing w:after="80"/>
+      </w:pPr>
       <w:r>
-        <w:t>本文件可以被官網、GitHub、AI、SDK、Whitepaper、CMC、CoinGecko、BscScan 與社群資料引用；引用時必須保留 Document ID、Version、Status、Level 與 GitHub Path。</w:t>
+        <w:t>本書的權威邊界是：本書是 GEN 系列的起點。它不取代 Runtime CURRENT，也不刪除既有白皮書；它把 KGEN 的最高創世語言整理成可引用的官方典藏。 若本書與下層實作衝突，應先檢查 GEN-001、GEN-002、GEN-004、Runtime CURRENT 與實作文件，再決定是修正文案、更新索引，或退回該實作。</w:t>
       </w:r>
     </w:p>
     <w:p>
@@ -545,18 +711,27 @@
       </w:r>
     </w:p>
     <w:p>
+      <w:pPr>
+        <w:spacing w:after="80"/>
+      </w:pPr>
       <w:r>
-        <w:t>KGEN 的核心理念以四個句子為底層語法：價格即座標，市場即宇宙，程式即生命，文明可演化。這些句子不是宣傳語，而是設計規則。</w:t>
+        <w:t>KGEN 的核心哲學不是行銷語，而是系統設計規則：價格即座標，市場即宇宙，程式即生命，文明可演化。價格即座標，表示價格不是孤立數字，而是時間、風險、玩家行為、資源、土地與文明位置共同作用後的座標。市場即宇宙，表示市場有邊界、重力、方向、歷史、未知地帶與探索成本。</w:t>
       </w:r>
     </w:p>
     <w:p>
+      <w:pPr>
+        <w:spacing w:after="80"/>
+      </w:pPr>
       <w:r>
-        <w:t>價格即座標，代表價格不是孤立數字，而是玩家、資源、風險、時間與文明位置的共同投影。市場即宇宙，代表市場具有邊界、重力、方向、速度、歷史與未知領域。</w:t>
+        <w:t>程式即生命，表示資料夾、檔案、函式、Runtime、README、白皮書、索引、神殿 UI 與 SDK schema 都是文明器官。文明可演化，表示玩家、AI、App、DNA、GA、土地、民宅、商店、神殿與文明科技都可以在 Canon 內累積成長。</w:t>
       </w:r>
     </w:p>
     <w:p>
+      <w:pPr>
+        <w:spacing w:after="80"/>
+      </w:pPr>
       <w:r>
-        <w:t>程式即生命，代表資料夾、檔案、函式、Runtime、README、白皮書與索引都是文明器官。文明可演化，代表玩家、AI、App、DNA、GA、土地與神殿都可以在規則內成長。</w:t>
+        <w:t>對本書而言，這套哲學落在以下具體命題：作為 KGEN 宇宙文明生命系統的母法級文件，定義世界觀、公理、生命觀、文明觀、文件體系與不可違反 Canon。 因此本書不能只列項目，它必須說明定義、規則、案例、流程、限制與風險。</w:t>
       </w:r>
     </w:p>
     <w:p>
@@ -568,8 +743,539 @@
       </w:r>
     </w:p>
     <w:p>
+      <w:pPr>
+        <w:spacing w:after="80"/>
+      </w:pPr>
       <w:r>
-        <w:t>本章固定官方 Canon 與基本定義。任何新文件、新神殿、新 SDK、新 AI 工作流或新遊戲規格，都不得與以下 Canon 衝突。</w:t>
+        <w:t>本章定義本書使用的官方詞彙。所有詞彙都必須回到 Genesis、Canon、Constitution、Runtime CURRENT 與 Universe Map，不得各自發明互相衝突的語言。</w:t>
+      </w:r>
+    </w:p>
+    <w:p>
+      <w:r>
+        <w:t>| Term | Definition |</w:t>
+      </w:r>
+    </w:p>
+    <w:p>
+      <w:r>
+        <w:t>|---|---|</w:t>
+      </w:r>
+    </w:p>
+    <w:p>
+      <w:r>
+        <w:t>| Genesis | 創世母法，定義所有後續 Canon、Constitution、Design Bible、Runtime 與 Implementation 的最高邊界。 |</w:t>
+      </w:r>
+    </w:p>
+    <w:p>
+      <w:r>
+        <w:t>| Universe Civilization Operating System | KGEN 的正式定位；市場、程式、神殿、土地、AI、DNA、GA 與 KGEN token 都在同一文明作業系統中運作。 |</w:t>
+      </w:r>
+    </w:p>
+    <w:p>
+      <w:r>
+        <w:t>| PrimeForge Mother Engine | 創世母機，代表文件、Runtime、AI 與文明規則的源頭引擎。 |</w:t>
+      </w:r>
+    </w:p>
+    <w:p>
+      <w:r>
+        <w:t>| Wild Land | 初始土地狀態，不由創世者全量販售，而由探索、建設、文明戰爭與自由市場交易取得。 |</w:t>
+      </w:r>
+    </w:p>
+    <w:p>
+      <w:r>
+        <w:t>| App Organism | App 生命體；具 DNA、AI、等級、技能、生命週期、交易與演化能力。 |</w:t>
+      </w:r>
+    </w:p>
+    <w:p>
+      <w:r>
+        <w:t>| Reality Bridge | 線上民宅、商店、神殿與真實世界商店、品牌、服務據點、會員系統的映射機制。 |</w:t>
+      </w:r>
+    </w:p>
+    <w:p>
+      <w:pPr>
+        <w:spacing w:after="80"/>
+      </w:pPr>
+      <w:r>
+        <w:t>這些定義的共同限制是：術語可以擴充，但不得改寫根本 Canon；設計可以分層，但不得把正式文件降格為臨時修補；實作可以迭代，但不得以新檔名逃避索引與治理。</w:t>
+      </w:r>
+    </w:p>
+    <w:p>
+      <w:pPr>
+        <w:pStyle w:val="Heading1"/>
+      </w:pPr>
+      <w:r>
+        <w:t>Chapter 4 / 第4章 宇宙架構</w:t>
+      </w:r>
+    </w:p>
+    <w:p>
+      <w:pPr>
+        <w:spacing w:after="80"/>
+      </w:pPr>
+      <w:r>
+        <w:t>KGEN 的完整架構不是單一網站、單一 token 或單一遊戲，而是生命鏈：</w:t>
+      </w:r>
+    </w:p>
+    <w:p>
+      <w:pPr>
+        <w:spacing w:after="80"/>
+      </w:pPr>
+      <w:r>
+        <w:t>Universe → Civilization → World → Temple → Land → Building → App → AI → DNA → Runtime → Code</w:t>
+      </w:r>
+    </w:p>
+    <w:p>
+      <w:pPr>
+        <w:spacing w:after="80"/>
+      </w:pPr>
+      <w:r>
+        <w:t>工程實作生命鏈則展開為：</w:t>
+      </w:r>
+    </w:p>
+    <w:p>
+      <w:pPr>
+        <w:spacing w:after="80"/>
+      </w:pPr>
+      <w:r>
+        <w:t>Universe → Civilization → World → Temple → Land → Building → NPC → AI → Module → DNA → Function → Code</w:t>
+      </w:r>
+    </w:p>
+    <w:p>
+      <w:pPr>
+        <w:spacing w:after="80"/>
+      </w:pPr>
+      <w:r>
+        <w:t>本書的架構必須掛在這條生命鏈上。Universe 是最上層邊界；Civilization 是制度核心；World 是文明展開的場；Temple 是生命神殿；Land 是可探索、建設、交易、戰爭取得的地；Building 是民宅、商店與服務節點；App 是生命；AI 是生命器官；DNA / GA 是演化核心；Runtime 是可執行法則；Code 是生命的細胞層。</w:t>
+      </w:r>
+    </w:p>
+    <w:p>
+      <w:pPr>
+        <w:pStyle w:val="Heading1"/>
+      </w:pPr>
+      <w:r>
+        <w:t>Chapter 5 / 第5章 神殿設計</w:t>
+      </w:r>
+    </w:p>
+    <w:p>
+      <w:pPr>
+        <w:spacing w:after="80"/>
+      </w:pPr>
+      <w:r>
+        <w:t>Universe Map V10.2 是 KGEN 世界觀與 Runtime 設計的正式來源之一，記錄 123 個座標概念，並以 16888 = 384,400 km 作為距離參考。Universe Map 的角色不是裝飾，而是讓神殿、土地、Portal、交易所、文明邊界與玩家探索具有可追溯位置。</w:t>
+      </w:r>
+    </w:p>
+    <w:p>
+      <w:pPr>
+        <w:spacing w:after="80"/>
+      </w:pPr>
+      <w:r>
+        <w:t>12345 五指山悟空財神殿是 Heart、wallet、玩家入口與 fortune temple；16888 廣寒宮是月相、觀測與市場節奏概念；11520 花果山交易所是 App、土地、神殿、AI、DNA、文明資產交易中心；18888 神明銀行是銀行、抵押、財庫、清算與公共資源概念。</w:t>
+      </w:r>
+    </w:p>
+    <w:p>
+      <w:pPr>
+        <w:spacing w:after="80"/>
+      </w:pPr>
+      <w:r>
+        <w:t>任何新宇宙設計都必須回答三個問題：它在 Universe Map 的哪個層級？它連到哪座神殿或哪塊土地？它如何回到文明經濟閉環？</w:t>
+      </w:r>
+    </w:p>
+    <w:p>
+      <w:pPr>
+        <w:pStyle w:val="Heading1"/>
+      </w:pPr>
+      <w:r>
+        <w:t>Chapter 6 / 第6章 玩家文明循環</w:t>
+      </w:r>
+    </w:p>
+    <w:p>
+      <w:pPr>
+        <w:spacing w:after="80"/>
+      </w:pPr>
+      <w:r>
+        <w:t>文明不是靜態背景，而是由土地、民宅、商店、App、AI、DNA、交易、KGEN、神殿、科技與戰爭形成的生命循環。KGEN 的標準遊戲經濟閉環為：</w:t>
+      </w:r>
+    </w:p>
+    <w:p>
+      <w:pPr>
+        <w:spacing w:after="80"/>
+      </w:pPr>
+      <w:r>
+        <w:t>探索 → 資源 → 土地 → 民宅 → 商店 → App → AI → DNA → 交易 → KGEN → 神殿 → 文明科技 → 文明戰爭 → 新土地 → 再探索</w:t>
+      </w:r>
+    </w:p>
+    <w:p>
+      <w:pPr>
+        <w:spacing w:after="80"/>
+      </w:pPr>
+      <w:r>
+        <w:t>土地制度是文明制度的基礎。土地初始為 Wild Land；創世者不販售所有土地；土地由探索、建設、文明戰爭與自由市場交易取得；土地可交易、可探索、可建設、可戰爭取得、可自由市場轉讓。民宅不是裝飾，民宅可演化為商店、交易所、神殿服務節點，並可映射到真實世界商店、品牌、服務據點與會員系統。</w:t>
+      </w:r>
+    </w:p>
+    <w:p>
+      <w:pPr>
+        <w:pStyle w:val="Heading1"/>
+      </w:pPr>
+      <w:r>
+        <w:t>Chapter 7 / 第7章 DNA 與 GA</w:t>
+      </w:r>
+    </w:p>
+    <w:p>
+      <w:pPr>
+        <w:spacing w:after="80"/>
+      </w:pPr>
+      <w:r>
+        <w:t>本章對齊 KGEN V7.5.2 合約與官方白皮書。KGEN token 是 KLINE GENESIS，部署於 BNB Smart Chain，標準為 BEP-20，總供應量 72,000,000 KGEN，decimals 為 18。AMM buy/sell 稅率固定為 0.30%，拆分為 Burn 0.10%、Bank 0.10%、Reward 0.05%、AutoLP 0.05%。Wallet-to-wallet transfers 不收稅。</w:t>
+      </w:r>
+    </w:p>
+    <w:p>
+      <w:r>
+        <w:t>| Item | Official Value |</w:t>
+      </w:r>
+    </w:p>
+    <w:p>
+      <w:r>
+        <w:t>|---|---|</w:t>
+      </w:r>
+    </w:p>
+    <w:p>
+      <w:r>
+        <w:t>| Name | KLINE GENESIS |</w:t>
+      </w:r>
+    </w:p>
+    <w:p>
+      <w:r>
+        <w:t>| Symbol | KGEN |</w:t>
+      </w:r>
+    </w:p>
+    <w:p>
+      <w:r>
+        <w:t>| Chain | BNB Smart Chain |</w:t>
+      </w:r>
+    </w:p>
+    <w:p>
+      <w:r>
+        <w:t>| Standard | BEP-20 |</w:t>
+      </w:r>
+    </w:p>
+    <w:p>
+      <w:r>
+        <w:t>| Total Supply | 72,000,000 KGEN |</w:t>
+      </w:r>
+    </w:p>
+    <w:p>
+      <w:r>
+        <w:t>| Decimals | 18 |</w:t>
+      </w:r>
+    </w:p>
+    <w:p>
+      <w:r>
+        <w:t>| Contract | 0xBA3d3810e58735cb6813bC1CDc5458C0d71432Be |</w:t>
+      </w:r>
+    </w:p>
+    <w:p>
+      <w:r>
+        <w:t>| AMM buy/sell tax | 0.30% |</w:t>
+      </w:r>
+    </w:p>
+    <w:p>
+      <w:r>
+        <w:t>| Burn | 0.10% |</w:t>
+      </w:r>
+    </w:p>
+    <w:p>
+      <w:r>
+        <w:t>| Bank | 0.10% |</w:t>
+      </w:r>
+    </w:p>
+    <w:p>
+      <w:r>
+        <w:t>| Reward | 0.05% |</w:t>
+      </w:r>
+    </w:p>
+    <w:p>
+      <w:r>
+        <w:t>| AutoLP | 0.05% |</w:t>
+      </w:r>
+    </w:p>
+    <w:p>
+      <w:r>
+        <w:t>| Wallet-to-wallet transfers | No tax |</w:t>
+      </w:r>
+    </w:p>
+    <w:p>
+      <w:r>
+        <w:t>| Fair Launch | No ICO / No IEO / No Presale |</w:t>
+      </w:r>
+    </w:p>
+    <w:p>
+      <w:pPr>
+        <w:spacing w:after="80"/>
+      </w:pPr>
+      <w:r>
+        <w:t>金融語言必須保持克制。KGEN 可描述文明能量、治理參與、神殿服務與市場流通，但不得承諾價格、收益、上市、交易量或外部平台審核結果。</w:t>
+      </w:r>
+    </w:p>
+    <w:p>
+      <w:pPr>
+        <w:pStyle w:val="Heading1"/>
+      </w:pPr>
+      <w:r>
+        <w:t>Chapter 8 / 第8章 金融系統</w:t>
+      </w:r>
+    </w:p>
+    <w:p>
+      <w:pPr>
+        <w:spacing w:after="80"/>
+      </w:pPr>
+      <w:r>
+        <w:t>遊戲系統是 KGEN 文明的可操作表面。玩家不是單純訪客，而是文明參與者；玩家透過探索取得資源，透過建設讓土地成為民宅，透過民宅形成商店，透過商店交易 App、AI、DNA、材料與服務，透過 KGEN 流通支持神殿與文明科技，最後透過文明戰爭與 Portal 探索新土地。</w:t>
+      </w:r>
+    </w:p>
+    <w:p>
+      <w:pPr>
+        <w:spacing w:after="80"/>
+      </w:pPr>
+      <w:r>
+        <w:t>本書對遊戲規則的具體要求是：任務、打怪、升級、採集、交易、修行、App 生產、AI 接入、DNA 演化與 GA 評分不能互相孤立。每個玩法都必須回到經濟閉環、生命鏈或治理紀錄。</w:t>
+      </w:r>
+    </w:p>
+    <w:p>
+      <w:pPr>
+        <w:spacing w:after="80"/>
+      </w:pPr>
+      <w:r>
+        <w:t>案例：若某神殿新功能需要新增 App，應把 App 登錄為生命器官，記錄 DNA、Runtime 接點、交易邊界與可演化規則，而不是把它當作單次工具。</w:t>
+      </w:r>
+    </w:p>
+    <w:p>
+      <w:pPr>
+        <w:pStyle w:val="Heading1"/>
+      </w:pPr>
+      <w:r>
+        <w:t>Chapter 9 / 第9章 AI 治理</w:t>
+      </w:r>
+    </w:p>
+    <w:p>
+      <w:pPr>
+        <w:spacing w:after="80"/>
+      </w:pPr>
+      <w:r>
+        <w:t>AI 在 KGEN 中是生命器官，不是最高主權者。AI 可協助閱讀、整理、生成文件、建立索引、驗證引用、產生 SDK 與實作輔助，但不得修改 Canon、不得推翻 Genesis、不得繞過 Constitution、不得任意新增 Runtime CURRENT_v2。</w:t>
+      </w:r>
+    </w:p>
+    <w:p>
+      <w:pPr>
+        <w:spacing w:after="80"/>
+      </w:pPr>
+      <w:r>
+        <w:t>AI 修改前必須依序讀取 Boot V1.4、Runtime CURRENT、Universe Map、AGENTS.md、README 與目標文件。AI 在程式修改前必須檢查 docs/、KGEN/、K線西遊記/、temples/12345/ 是否已有相同功能。</w:t>
+      </w:r>
+    </w:p>
+    <w:p>
+      <w:pPr>
+        <w:spacing w:after="80"/>
+      </w:pPr>
+      <w:r>
+        <w:t>案例：若 AI 發現某正式器官被命名為 kgen-12345-ui-v3.js，應治理為固定正式檔名 kgen-12345-ui.js，版本寫入檔案內，而不是保留版本號正式器官。</w:t>
+      </w:r>
+    </w:p>
+    <w:p>
+      <w:pPr>
+        <w:pStyle w:val="Heading1"/>
+      </w:pPr>
+      <w:r>
+        <w:t>Chapter 10 / 第10章 GitHub 規範</w:t>
+      </w:r>
+    </w:p>
+    <w:p>
+      <w:pPr>
+        <w:spacing w:after="80"/>
+      </w:pPr>
+      <w:r>
+        <w:t>Runtime CURRENT 是正式版本；Boot V1.4 是 AI 開機入口；Universe Map 是世界座標來源；AGENTS.md 是 AI 工作守則；README.md 是 public master；Genesis Library 是官方典藏文件系統。這些層級不得互相混淆。</w:t>
+      </w:r>
+    </w:p>
+    <w:p>
+      <w:pPr>
+        <w:spacing w:after="80"/>
+      </w:pPr>
+      <w:r>
+        <w:t>GitHub 規範要求：新增文件必須更新索引、README 與用途；白皮書、Runtime、Boot、Constitution 更新必須採用完整版累積更新；不得只保留差異版；不得要求讀者回頭查舊版。程式器官不得使用 patch/fix/hotfix/stable/final 這類名稱作為正式檔案。</w:t>
+      </w:r>
+    </w:p>
+    <w:p>
+      <w:pPr>
+        <w:spacing w:after="80"/>
+      </w:pPr>
+      <w:r>
+        <w:t>本書的實作若需要 schema、module、README 或 assets，都必須留下完整路徑、用途與依賴關係。</w:t>
+      </w:r>
+    </w:p>
+    <w:p>
+      <w:pPr>
+        <w:pStyle w:val="Heading1"/>
+      </w:pPr>
+      <w:r>
+        <w:t>Chapter 11 / 第11章 文件體系</w:t>
+      </w:r>
+    </w:p>
+    <w:p>
+      <w:pPr>
+        <w:spacing w:after="80"/>
+      </w:pPr>
+      <w:r>
+        <w:t>本章把本書落到檔案與流程。正式 Markdown 路徑為 KGEN-Genesis/GEN-001_Genesis_Bible/KGEN_Genesis_Bible_V1.0.md，同步 DOCX 與 PDF 位於同一目錄。每本書的 README 說明檔案用途，assets/README.md 說明資產狀態。</w:t>
+      </w:r>
+    </w:p>
+    <w:p>
+      <w:pPr>
+        <w:spacing w:after="80"/>
+      </w:pPr>
+      <w:r>
+        <w:t>實作流程：</w:t>
+      </w:r>
+    </w:p>
+    <w:p>
+      <w:pPr>
+        <w:pStyle w:val="ListNumber"/>
+      </w:pPr>
+      <w:r>
+        <w:t>讀取 Genesis、Canon、Constitution、Runtime CURRENT、Universe Map。</w:t>
+      </w:r>
+    </w:p>
+    <w:p>
+      <w:pPr>
+        <w:pStyle w:val="ListNumber"/>
+      </w:pPr>
+      <w:r>
+        <w:t>確認本書 Document ID、UUID、Level、Status、Dependencies、Related Documents。</w:t>
+      </w:r>
+    </w:p>
+    <w:p>
+      <w:pPr>
+        <w:pStyle w:val="ListNumber"/>
+      </w:pPr>
+      <w:r>
+        <w:t>修改 Markdown。</w:t>
+      </w:r>
+    </w:p>
+    <w:p>
+      <w:pPr>
+        <w:pStyle w:val="ListNumber"/>
+      </w:pPr>
+      <w:r>
+        <w:t>同步 DOCX 與 PDF。</w:t>
+      </w:r>
+    </w:p>
+    <w:p>
+      <w:pPr>
+        <w:pStyle w:val="ListNumber"/>
+      </w:pPr>
+      <w:r>
+        <w:t>更新 KGEN_MASTER_INDEX、000_INDEX、CHANGELOG 與每本 README。</w:t>
+      </w:r>
+    </w:p>
+    <w:p>
+      <w:pPr>
+        <w:pStyle w:val="ListNumber"/>
+      </w:pPr>
+      <w:r>
+        <w:t>驗證出版禁語清單為零命中，也沒有保護路徑變更。</w:t>
+      </w:r>
+    </w:p>
+    <w:p>
+      <w:pPr>
+        <w:spacing w:after="80"/>
+      </w:pPr>
+      <w:r>
+        <w:t>案例：若某文件要新增宇宙設定，應先確認 GEN-002 Canon 與 GEN-003 Universe Design 是否已有相同定義，再以累積段落加入。</w:t>
+      </w:r>
+    </w:p>
+    <w:p>
+      <w:pPr>
+        <w:pStyle w:val="Heading1"/>
+      </w:pPr>
+      <w:r>
+        <w:t>Chapter 12 / 第12章 Roadmap</w:t>
+      </w:r>
+    </w:p>
+    <w:p>
+      <w:pPr>
+        <w:spacing w:after="80"/>
+      </w:pPr>
+      <w:r>
+        <w:t>Roadmap 的目的不是承諾結果，而是規劃可驗證的累積方向。V1.0 建立完整可閱讀的官方典藏；V1.1 可補充封面、圖表、更多 schema 與平台版資料包；V2.0 可加入實作案例、更多宇宙圖層與 SDK 範例。</w:t>
+      </w:r>
+    </w:p>
+    <w:p>
+      <w:pPr>
+        <w:spacing w:after="80"/>
+      </w:pPr>
+      <w:r>
+        <w:t>每次 Roadmap 更新都必須記錄依賴、風險、完成條件與驗證方式。若涉及 token、交易、金融或平台登錄，必須同時更新風險聲明，且不得描述保證收益或保證通過。</w:t>
+      </w:r>
+    </w:p>
+    <w:p>
+      <w:pPr>
+        <w:spacing w:after="80"/>
+      </w:pPr>
+      <w:r>
+        <w:t>未來 GEN-013 以後的文件必須先取得 Document ID，再建立完整 Markdown、DOCX、PDF、README、assets、索引與修訂紀錄。</w:t>
+      </w:r>
+    </w:p>
+    <w:p>
+      <w:pPr>
+        <w:pStyle w:val="Heading1"/>
+      </w:pPr>
+      <w:r>
+        <w:t>Chapter 13 / 第13章 治理</w:t>
+      </w:r>
+    </w:p>
+    <w:p>
+      <w:pPr>
+        <w:spacing w:after="80"/>
+      </w:pPr>
+      <w:r>
+        <w:t>治理原則是累積、可追溯、不可冒充。L0 Genesis、L1 Canon、L2 Constitution 的改動需要明確人工授權；L3 Design Bible 可以擴充，但不得推翻 L0-L2；L4 Runtime 以 CURRENT 為正式版本；L5 Implementation 必須更新索引與 README；L6 Experimental 不得冒充正式版本；L7 Archive 不得當作最新規格。</w:t>
+      </w:r>
+    </w:p>
+    <w:p>
+      <w:pPr>
+        <w:spacing w:after="80"/>
+      </w:pPr>
+      <w:r>
+        <w:t>本書風險焦點：Genesis Bible 是制度與世界觀文件，不構成投資建議、收益保證、代幣銷售文件或法律意見。</w:t>
+      </w:r>
+    </w:p>
+    <w:p>
+      <w:pPr>
+        <w:spacing w:after="80"/>
+      </w:pPr>
+      <w:r>
+        <w:t>限制：不得以市場宣傳語取代 Canon。; 不得以短期 UI 修補推翻 Genesis。; 不得把正式 Runtime 或正式器官改成 v2/v3/final/hotfix 檔名。。任何違反限制的內容都應被標記、退回或修正，而不是直接合併進正式典藏。</w:t>
+      </w:r>
+    </w:p>
+    <w:p>
+      <w:pPr>
+        <w:pStyle w:val="Heading1"/>
+      </w:pPr>
+      <w:r>
+        <w:t>Chapter 14 / 第14章 附錄A 官方名詞</w:t>
+      </w:r>
+    </w:p>
+    <w:p>
+      <w:pPr>
+        <w:spacing w:after="80"/>
+      </w:pPr>
+      <w:r>
+        <w:t>本章提供可被其他文件引用的附錄資料。</w:t>
+      </w:r>
+    </w:p>
+    <w:p>
+      <w:pPr>
+        <w:spacing w:after="80"/>
+      </w:pPr>
+      <w:r>
+        <w:t>官方 Canon：</w:t>
       </w:r>
     </w:p>
     <w:p>
@@ -661,288 +1367,35 @@
       </w:r>
     </w:p>
     <w:p>
+      <w:pPr>
+        <w:pStyle w:val="ListBullet"/>
+      </w:pPr>
       <w:r>
-        <w:t>生命鏈：`Universe → Civilization → World → Temple → Land → Building → App → AI → DNA → Runtime → Code`。完整工程生命鏈：`Universe → Civilization → World → Temple → Land → House → NPC → Player → AI → DNA → Gene → Runtime → Module → Function → Code`。</w:t>
+        <w:t>土地初始為 Wild Land，創世者不販售所有土地。</w:t>
       </w:r>
     </w:p>
     <w:p>
+      <w:pPr>
+        <w:pStyle w:val="ListBullet"/>
+      </w:pPr>
       <w:r>
-        <w:t>若未來新增設定，只能擴充既有生命鏈、文明循環與 Runtime，不得推翻創世公理。</w:t>
+        <w:t>土地由文明探索、建設、戰爭與自由市場交易取得。</w:t>
       </w:r>
     </w:p>
     <w:p>
       <w:pPr>
-        <w:pStyle w:val="Heading1"/>
+        <w:pStyle w:val="ListBullet"/>
       </w:pPr>
       <w:r>
-        <w:t>Chapter 4 / 第4章 宇宙架構</w:t>
+        <w:t>土地可交易、可探索、可建設、可戰爭取得、可自由市場轉讓。</w:t>
       </w:r>
     </w:p>
     <w:p>
+      <w:pPr>
+        <w:pStyle w:val="ListBullet"/>
+      </w:pPr>
       <w:r>
-        <w:t>KGEN Genesis Bible 的架構與整體 KGEN 宇宙架構一致：Universe 產生 Civilization，Civilization 展開 World，World 形成 Temple 群，Temple 連接 Land、Building、App、AI、DNA、Runtime 與 Code。</w:t>
-      </w:r>
-    </w:p>
-    <w:p>
-      <w:r>
-        <w:t>正式架構不允許以重複資料夾、重複 Runtime、版本號正式器官、patch/fix/hotfix/stable/final 類正式檔名來替代既有器官。若相同功能已存在，必須先閱讀與合併，而不是新增平行世界。</w:t>
-      </w:r>
-    </w:p>
-    <w:p>
-      <w:r>
-        <w:t>本書特定焦點為：創世宣言、七大公理、官方名詞、Genesis Bible。這些焦點必須回到同一套 Universe Runtime，而不能成為互相衝突的系統。</w:t>
-      </w:r>
-    </w:p>
-    <w:p>
-      <w:pPr>
-        <w:pStyle w:val="Heading1"/>
-      </w:pPr>
-      <w:r>
-        <w:t>Chapter 5 / 第5章 神殿設計</w:t>
-      </w:r>
-    </w:p>
-    <w:p>
-      <w:r>
-        <w:t>Universe Map V10.2 是本套文件的世界觀來源之一，記錄 123 個座標概念，並以 16888 = 384,400 km 作為距離參考。</w:t>
-      </w:r>
-    </w:p>
-    <w:p>
-      <w:r>
-        <w:t>12345 五指山悟空財神殿是 Heart、wallet、玩家入口與 fortune temple；11520 花果山交易所是文明金融中心、App Marketplace、土地交易中心、神殿交易中心、AI Marketplace 與 DNA Marketplace；18888 神明銀行是銀行、抵押、財庫與清算概念。</w:t>
-      </w:r>
-    </w:p>
-    <w:p>
-      <w:r>
-        <w:t>Universe 設計不要求一次完成完整互動地圖，但所有神殿、Portal、交易所與文明地點都必須能回到 Universe Map 與 Runtime 的座標語言。</w:t>
-      </w:r>
-    </w:p>
-    <w:p>
-      <w:pPr>
-        <w:pStyle w:val="Heading1"/>
-      </w:pPr>
-      <w:r>
-        <w:t>Chapter 6 / 第6章 玩家文明循環</w:t>
-      </w:r>
-    </w:p>
-    <w:p>
-      <w:r>
-        <w:t>文明循環由土地、神殿、民宅、商店、NPC、玩家、AI、DNA、交易與科技構成。民宅不是裝飾，民宅就是商店；Building 可販售商品、App、AI、DNA、土地、裝備、材料與文明科技。</w:t>
-      </w:r>
-    </w:p>
-    <w:p>
-      <w:pPr>
-        <w:pStyle w:val="ListBullet"/>
-      </w:pPr>
-      <w:r>
-        <w:t>土地不是創世者販售商品。</w:t>
-      </w:r>
-    </w:p>
-    <w:p>
-      <w:pPr>
-        <w:pStyle w:val="ListBullet"/>
-      </w:pPr>
-      <w:r>
-        <w:t>所有土地初始皆為 Wild Land。</w:t>
-      </w:r>
-    </w:p>
-    <w:p>
-      <w:pPr>
-        <w:pStyle w:val="ListBullet"/>
-      </w:pPr>
-      <w:r>
-        <w:t>土地由探索、建設、文明戰爭與自由市場交易取得。</w:t>
-      </w:r>
-    </w:p>
-    <w:p>
-      <w:pPr>
-        <w:pStyle w:val="ListBullet"/>
-      </w:pPr>
-      <w:r>
-        <w:t>所有土地皆可探索、建設、交易與戰爭。</w:t>
-      </w:r>
-    </w:p>
-    <w:p>
-      <w:r>
-        <w:t>文明規模由 Wild Land 展開為 Temple、Village、City、Kingdom、Civilization、Planet、Universe。每一層都需要可追溯的來源、治理與交易紀錄。</w:t>
-      </w:r>
-    </w:p>
-    <w:p>
-      <w:pPr>
-        <w:pStyle w:val="Heading1"/>
-      </w:pPr>
-      <w:r>
-        <w:t>Chapter 7 / 第7章 DNA 與 GA</w:t>
-      </w:r>
-    </w:p>
-    <w:p>
-      <w:r>
-        <w:t>KGEN 金融系統以合約與文明循環共同約束。KGEN Token 名稱為 KLINE GENESIS，符號 KGEN，部署於 BNB Smart Chain，標準為 BEP-20，總供應量 72,000,000 KGEN，decimals 為 18。</w:t>
-      </w:r>
-    </w:p>
-    <w:p>
-      <w:r>
-        <w:t>KGEN_Token_V7_5_2.sol 固定 AMM buy/sell 稅率為 0.30%，其中 Burn 0.10%、Bank 0.10%、Reward 0.05%、AutoLP 0.05%。Wallet-to-wallet transfers 無稅。合約沒有 setTax / updateTax / setFees / updateFees 類稅率 setter。</w:t>
-      </w:r>
-    </w:p>
-    <w:p>
-      <w:r>
-        <w:t>金融閉環：`探索 → 取得資源 → 建設 → NPC → 交易 → 市場 → KGEN → Temple → 文明 → 科技 → 演化 → 再次探索`。此閉環描述文明資源流，不構成投資建議、收益承諾或價格保證。</w:t>
-      </w:r>
-    </w:p>
-    <w:p>
-      <w:pPr>
-        <w:pStyle w:val="Heading1"/>
-      </w:pPr>
-      <w:r>
-        <w:t>Chapter 8 / 第8章 金融系統</w:t>
-      </w:r>
-    </w:p>
-    <w:p>
-      <w:r>
-        <w:t>遊戲核心閉環必須完整，不能只做單一介面或單一任務。KGEN Game 以玩家行動推動文明：`探索 → 採集 → 建造 → 生產 → 交易 → 金融 → 任務 → 修行 → 打怪 → 升級 → DNA 演化 → GA 演化 → 文明科技 → 神殿建設 → 土地占領 → 文明戰爭 → 宇宙邊界探索 → Portal 傳送 → 治理`。</w:t>
-      </w:r>
-    </w:p>
-    <w:p>
-      <w:r>
-        <w:t>打怪練等等於 DNA 升級，GA100 → GA1000 代表策略、模型、績效與文明技能的可評估演化。回測歷史績效、多空精準度、賺錢升等、銀行聘請基金操盤手與績效分紅都是設計語言，但對外呈現時必須保留風險邊界。</w:t>
-      </w:r>
-    </w:p>
-    <w:p>
-      <w:r>
-        <w:t>遊戲產物不能脫離 Canon。探索取得資源，資源推動建設，建設生成交易，交易流通 KGEN，KGEN 支持神殿與文明科技，再引導新探索。</w:t>
-      </w:r>
-    </w:p>
-    <w:p>
-      <w:pPr>
-        <w:pStyle w:val="Heading1"/>
-      </w:pPr>
-      <w:r>
-        <w:t>Chapter 9 / 第9章 AI 治理</w:t>
-      </w:r>
-    </w:p>
-    <w:p>
-      <w:r>
-        <w:t>AI 治理規則：AI 不得修改 Canon；AI 必須遵守 Genesis；AI 必須遵守 Constitution；AI 可擴充，但不可推翻官方設定。</w:t>
-      </w:r>
-    </w:p>
-    <w:p>
-      <w:r>
-        <w:t>任何 AI 修改前必須依序讀取 Boot V1.4、Runtime CURRENT、Universe Map、AGENTS.md、README 與目標文件。AI 不得任意建立新版 Runtime，不得建立 patch/fix/hotfix/stable 正式檔，不得新增 bootstrap 來取代既有 bootstrap。</w:t>
-      </w:r>
-    </w:p>
-    <w:p>
-      <w:r>
-        <w:t>AI 的正確角色是整理、驗證、生成文件、協助 SDK 與實作，而不是把個別修補變成新的宇宙法則。</w:t>
-      </w:r>
-    </w:p>
-    <w:p>
-      <w:pPr>
-        <w:pStyle w:val="Heading1"/>
-      </w:pPr>
-      <w:r>
-        <w:t>Chapter 10 / 第10章 GitHub 規範</w:t>
-      </w:r>
-    </w:p>
-    <w:p>
-      <w:r>
-        <w:t>Runtime CURRENT 是正式版本；歷史 Runtime 是脈絡與 archive，不得被誤認為最新指令。Boot V1.4 是 AI 開機入口，Universe Map 是世界座標來源，AGENTS.md 是本地工作守則。</w:t>
-      </w:r>
-    </w:p>
-    <w:p>
-      <w:r>
-        <w:t>文件、程式與資產都屬於生命系統：Folder = Body，File = Organ，Function = Cell，DNA = Civilization Gene，RNA = Runtime Instruction，README = Civilization Memory。</w:t>
-      </w:r>
-    </w:p>
-    <w:p>
-      <w:r>
-        <w:t>本書不得建立新的 Runtime CURRENT_v2，不得複製 Boot，不得新增同功能不同版本檔。若需要更新，必須使用完整版累積更新，保留舊內容與引用脈絡。</w:t>
-      </w:r>
-    </w:p>
-    <w:p>
-      <w:pPr>
-        <w:pStyle w:val="Heading1"/>
-      </w:pPr>
-      <w:r>
-        <w:t>Chapter 11 / 第11章 文件體系</w:t>
-      </w:r>
-    </w:p>
-    <w:p>
-      <w:r>
-        <w:t>本文件正式路徑為 `KGEN-Genesis/GEN-001_Genesis_Bible/KGEN_Genesis_Bible_V1.0.md`。同目錄同步提供 DOCX、PDF、README 與 assets/README.md。</w:t>
-      </w:r>
-    </w:p>
-    <w:p>
-      <w:r>
-        <w:t>所有新文件必須登錄於 KGEN-Genesis/000_INDEX/README.md 與 KGEN-Genesis/KGEN_MASTER_INDEX.md，並保持 Document ID、UUID、Version、Status、Level、Dependencies、Related Documents、Last Update、Maintainer 可查。</w:t>
-      </w:r>
-    </w:p>
-    <w:p>
-      <w:r>
-        <w:t>Implementation 層文件可以調整呈現方式，但不得改變 L0 Genesis、L1 Canon、L2 Constitution 與 Runtime CURRENT 的正式含義。</w:t>
-      </w:r>
-    </w:p>
-    <w:p>
-      <w:pPr>
-        <w:pStyle w:val="Heading1"/>
-      </w:pPr>
-      <w:r>
-        <w:t>Chapter 12 / 第12章 Roadmap</w:t>
-      </w:r>
-    </w:p>
-    <w:p>
-      <w:r>
-        <w:t>V1.0 的目標是建立完整可引用的 Genesis Library 基礎版。V1.1 可以補充圖表、封面與平台審核版摘要；V2.0 可以在不推翻 V1.0 的基礎上加入更多實作案例。</w:t>
-      </w:r>
-    </w:p>
-    <w:p>
-      <w:r>
-        <w:t>後續 GEN-013 以後若開放，必須先在 000_INDEX 中取得 Document ID，再建立目錄與完整出版格式。CIV、TEM、FIN、AI、WEB、SDK、MAP 系列文件亦遵循同一規格。</w:t>
-      </w:r>
-    </w:p>
-    <w:p>
-      <w:r>
-        <w:t>任何 Roadmap 只能描述計畫與方向，不得描述保證收益、保證價格或外部平台一定通過審核。</w:t>
-      </w:r>
-    </w:p>
-    <w:p>
-      <w:pPr>
-        <w:pStyle w:val="Heading1"/>
-      </w:pPr>
-      <w:r>
-        <w:t>Chapter 13 / 第13章 治理</w:t>
-      </w:r>
-    </w:p>
-    <w:p>
-      <w:r>
-        <w:t>Governance 的核心是累積而非覆蓋。白皮書、Runtime、Boot、Constitution 更新，一律採用完整版累積更新，不得刪除舊內容，不得只保留差異版，不得要求讀者回頭查舊版。</w:t>
-      </w:r>
-    </w:p>
-    <w:p>
-      <w:r>
-        <w:t>Document Level 控制修改權限：L0-L2 需要人工明確批准；L3-L5 可在任務授權下更新；L6 必須標為 experimental；L7 只能 archive，不得冒充 CURRENT。</w:t>
-      </w:r>
-    </w:p>
-    <w:p>
-      <w:r>
-        <w:t>任何提交都必須確認未誤改 contracts、12345 神殿、wallet、bridge、Runtime CURRENT、Boot 或已完成 final-whitepaper。</w:t>
-      </w:r>
-    </w:p>
-    <w:p>
-      <w:pPr>
-        <w:pStyle w:val="Heading1"/>
-      </w:pPr>
-      <w:r>
-        <w:t>Chapter 14 / 第14章 附錄A 官方名詞</w:t>
-      </w:r>
-    </w:p>
-    <w:p>
-      <w:r>
-        <w:t>官方名詞：KGEN = KLINE GENESIS；KLINE ODYSSEY = 專案宇宙；PrimeForge Mother Engine = 創世母機；Universe Runtime = 宇宙執行法則；Temple = 生命神殿；App = 可演化生命。</w:t>
-      </w:r>
-    </w:p>
-    <w:p>
-      <w:r>
-        <w:t>App 生命規則：</w:t>
+        <w:t>民宅可演化為商店、交易所、神殿服務節點。</w:t>
       </w:r>
     </w:p>
     <w:p>
@@ -958,7 +1411,7 @@
         <w:pStyle w:val="ListBullet"/>
       </w:pPr>
       <w:r>
-        <w:t>每個 App 具有 DNA、生命週期、AI、等級與技能。</w:t>
+        <w:t>App 可交易、組裝、合成、拆解、升級、租賃、繁殖、演化。</w:t>
       </w:r>
     </w:p>
     <w:p>
@@ -966,7 +1419,7 @@
         <w:pStyle w:val="ListBullet"/>
       </w:pPr>
       <w:r>
-        <w:t>App 可組裝、拆解、融合、演化、繁殖、交易、租賃與升級。</w:t>
+        <w:t>AI 是生命器官，可成長、可治理、可接入 Runtime。</w:t>
       </w:r>
     </w:p>
     <w:p>
@@ -974,10 +1427,29 @@
         <w:pStyle w:val="ListBullet"/>
       </w:pPr>
       <w:r>
-        <w:t>每個 App 都可以成為新的生命。</w:t>
+        <w:t>DNA / GA 是生命與策略演化核心。</w:t>
       </w:r>
     </w:p>
     <w:p>
+      <w:pPr>
+        <w:pStyle w:val="ListBullet"/>
+      </w:pPr>
+      <w:r>
+        <w:t>11520 花果山交易所是 App、土地、神殿、AI、DNA、文明資產的交易中心。</w:t>
+      </w:r>
+    </w:p>
+    <w:p>
+      <w:pPr>
+        <w:pStyle w:val="ListBullet"/>
+      </w:pPr>
+      <w:r>
+        <w:t>實體商店與實體神殿可以作為未來連結功能；線上民宅、商店、神殿可映射到真實世界商店、品牌、服務據點與會員系統。</w:t>
+      </w:r>
+    </w:p>
+    <w:p>
+      <w:pPr>
+        <w:spacing w:after="80"/>
+      </w:pPr>
       <w:r>
         <w:t>官方連結：</w:t>
       </w:r>
@@ -1011,7 +1483,31 @@
         <w:pStyle w:val="ListBullet"/>
       </w:pPr>
       <w:r>
+        <w:t>PancakeSwap: https://pancakeswap.finance/swap?outputCurrency=0xBA3d3810e58735cb6813bC1CDc5458C0d71432Be</w:t>
+      </w:r>
+    </w:p>
+    <w:p>
+      <w:pPr>
+        <w:pStyle w:val="ListBullet"/>
+      </w:pPr>
+      <w:r>
         <w:t>GeckoTerminal: https://www.geckoterminal.com/bsc/pools/0xf36640d7327b53ba3d7fcc1d98dfc1b85574b6c2</w:t>
+      </w:r>
+    </w:p>
+    <w:p>
+      <w:pPr>
+        <w:pStyle w:val="ListBullet"/>
+      </w:pPr>
+      <w:r>
+        <w:t>CMC DexScan: https://coinmarketcap.com/dexscan/bsc/0xf36640d7327b53ba3d7fcc1d98dfc1b85574b6c2/</w:t>
+      </w:r>
+    </w:p>
+    <w:p>
+      <w:pPr>
+        <w:pStyle w:val="ListBullet"/>
+      </w:pPr>
+      <w:r>
+        <w:t>DexScreener: https://dexscreener.com/bsc/0xf36640d7327b53ba3d7fcc1d98dfc1b85574b6c2</w:t>
       </w:r>
     </w:p>
     <w:p>
@@ -1036,6 +1532,46 @@
       </w:pPr>
       <w:r>
         <w:t>YouTube: https://www.youtube.com/@klineodyssey</w:t>
+      </w:r>
+    </w:p>
+    <w:p>
+      <w:pPr>
+        <w:spacing w:after="80"/>
+      </w:pPr>
+      <w:r>
+        <w:t>本書規則：</w:t>
+      </w:r>
+    </w:p>
+    <w:p>
+      <w:pPr>
+        <w:pStyle w:val="ListBullet"/>
+      </w:pPr>
+      <w:r>
+        <w:t>任何文件、神殿、App、AI、SDK 或前端不得推翻本書所列 Canon。</w:t>
+      </w:r>
+    </w:p>
+    <w:p>
+      <w:pPr>
+        <w:pStyle w:val="ListBullet"/>
+      </w:pPr>
+      <w:r>
+        <w:t>任何新增設定必須是累積擴充，不得要求讀者回頭查舊版才能理解新版。</w:t>
+      </w:r>
+    </w:p>
+    <w:p>
+      <w:pPr>
+        <w:pStyle w:val="ListBullet"/>
+      </w:pPr>
+      <w:r>
+        <w:t>所有生命鏈與經濟閉環必須回到 Universe Runtime 與 KGEN token 的公開規則。</w:t>
+      </w:r>
+    </w:p>
+    <w:p>
+      <w:pPr>
+        <w:spacing w:after="80"/>
+      </w:pPr>
+      <w:r>
+        <w:t>本書流程：Genesis → Canon → Constitution → Design Bible → Runtime → Implementation → Archive。</w:t>
       </w:r>
     </w:p>
     <w:p>
@@ -1058,25 +1594,36 @@
     </w:p>
     <w:p>
       <w:r>
-        <w:t>| V1.0 | 2026-07-09 | Draft for Review | Genesis Library V1.0 official draft edition. |</w:t>
+        <w:t>| V1.0 Initial | 2026-07-09 | Draft for Review | Established initial Genesis Library structure and publication outputs. |</w:t>
       </w:r>
     </w:p>
     <w:p>
       <w:r>
-        <w:t>未來版本必須在此章累積記錄，不得刪除 V1.0 的歷史。</w:t>
+        <w:t>| V1.0 Full Canon Set | 2026-07-09 | Official V1.0 Full Canon Set | Expanded this book into a complete official readable canon edition with definitions, rules, cases, flows, restrictions, risk notice, and synchronized Markdown / DOCX / PDF. |</w:t>
       </w:r>
     </w:p>
     <w:p>
       <w:pPr>
-        <w:pStyle w:val="Heading1"/>
+        <w:spacing w:after="80"/>
       </w:pPr>
       <w:r>
-        <w:t>Cross-Reference Policy</w:t>
+        <w:t>修訂紀錄不得刪除舊版本。未來任何更新都必須累積記錄原因、範圍、依賴、風險與輸出格式。</w:t>
       </w:r>
     </w:p>
     <w:p>
+      <w:pPr>
+        <w:pStyle w:val="Heading1"/>
+      </w:pPr>
       <w:r>
-        <w:t>本文件屬於 KGEN Genesis Library V1.0。所有引用必須保留 Document ID、Version、Status、Level、GitHub Path 與 UUID。外部文件若需要摘要本文件，應引用本 Markdown、DOCX 或 PDF，而不是轉述未登錄的片段。</w:t>
+        <w:t>Independent Reading Statement</w:t>
+      </w:r>
+    </w:p>
+    <w:p>
+      <w:pPr>
+        <w:spacing w:after="80"/>
+      </w:pPr>
+      <w:r>
+        <w:t>本文件可獨立閱讀。讀者即使尚未讀過其他 GEN 文件，也可以透過本書理解 KGEN 創世聖典 的定義、規則、流程、限制與風險；若需要查證來源，請依 Dependencies 與 Related Documents 追溯。</w:t>
       </w:r>
     </w:p>
     <w:p>
@@ -1088,13 +1635,16 @@
       </w:r>
     </w:p>
     <w:p>
+      <w:pPr>
+        <w:spacing w:after="80"/>
+      </w:pPr>
       <w:r>
-        <w:t>本文件為 KGEN 宇宙文明、文件治理、遊戲設計、AI Runtime 與金融系統的官方出版草案。它不是投資建議，不承諾收益，不保證價格，不構成證券發行或募資邀約。KGEN token 相關資訊以鏈上合約、BscScan 與官方白皮書為準。</w:t>
+        <w:t>本文件為 KGEN 宇宙文明、文件治理、遊戲設計、AI Runtime、SDK 或金融系統的官方典藏文件。它不是投資建議、法律意見、收益保證、代幣銷售文件或外部平台通過承諾。KGEN token 相關資訊以鏈上合約、BscScan、官方白皮書與 GitHub repository 為準。使用者需自行承擔市場波動、智能合約、流動性、監管、錢包安全與操作錯誤等風險。</w:t>
       </w:r>
     </w:p>
     <w:sectPr>
       <w:pgSz w:w="12240" w:h="15840"/>
-      <w:pgMar w:top="1037" w:right="1037" w:bottom="1037" w:left="1037" w:header="720" w:footer="720" w:gutter="0"/>
+      <w:pgMar w:top="1008" w:right="1080" w:bottom="1008" w:left="1080" w:header="720" w:footer="720" w:gutter="0"/>
       <w:cols w:space="720"/>
       <w:docGrid w:linePitch="360"/>
     </w:sectPr>
@@ -1466,7 +2016,7 @@
     <w:qFormat/>
     <w:rsid w:val="00FC693F"/>
     <w:rPr>
-      <w:rFonts w:ascii="Microsoft JhengHei" w:hAnsi="Microsoft JhengHei" w:eastAsia="Microsoft JhengHei"/>
+      <w:rFonts w:ascii="Microsoft JhengHei" w:hAnsi="Microsoft JhengHei"/>
       <w:sz w:val="21"/>
     </w:rPr>
   </w:style>
@@ -1529,7 +2079,7 @@
       <w:outlineLvl w:val="0"/>
     </w:pPr>
     <w:rPr>
-      <w:rFonts w:asciiTheme="majorHAnsi" w:eastAsiaTheme="majorEastAsia" w:hAnsiTheme="majorHAnsi" w:cstheme="majorBidi" w:ascii="Microsoft JhengHei" w:hAnsi="Microsoft JhengHei" w:eastAsia="Microsoft JhengHei"/>
+      <w:rFonts w:asciiTheme="majorHAnsi" w:eastAsiaTheme="majorEastAsia" w:hAnsiTheme="majorHAnsi" w:cstheme="majorBidi"/>
       <w:b/>
       <w:bCs/>
       <w:color w:val="365F91" w:themeColor="accent1" w:themeShade="BF"/>
@@ -1553,7 +2103,7 @@
       <w:outlineLvl w:val="1"/>
     </w:pPr>
     <w:rPr>
-      <w:rFonts w:asciiTheme="majorHAnsi" w:eastAsiaTheme="majorEastAsia" w:hAnsiTheme="majorHAnsi" w:cstheme="majorBidi" w:ascii="Microsoft JhengHei" w:hAnsi="Microsoft JhengHei" w:eastAsia="Microsoft JhengHei"/>
+      <w:rFonts w:asciiTheme="majorHAnsi" w:eastAsiaTheme="majorEastAsia" w:hAnsiTheme="majorHAnsi" w:cstheme="majorBidi"/>
       <w:b/>
       <w:bCs/>
       <w:color w:val="4F81BD" w:themeColor="accent1"/>
@@ -1577,7 +2127,7 @@
       <w:outlineLvl w:val="2"/>
     </w:pPr>
     <w:rPr>
-      <w:rFonts w:asciiTheme="majorHAnsi" w:eastAsiaTheme="majorEastAsia" w:hAnsiTheme="majorHAnsi" w:cstheme="majorBidi" w:ascii="Microsoft JhengHei" w:hAnsi="Microsoft JhengHei" w:eastAsia="Microsoft JhengHei"/>
+      <w:rFonts w:asciiTheme="majorHAnsi" w:eastAsiaTheme="majorEastAsia" w:hAnsiTheme="majorHAnsi" w:cstheme="majorBidi"/>
       <w:b/>
       <w:bCs/>
       <w:color w:val="4F81BD" w:themeColor="accent1"/>
@@ -1818,7 +2368,7 @@
       <w:contextualSpacing/>
     </w:pPr>
     <w:rPr>
-      <w:rFonts w:asciiTheme="majorHAnsi" w:eastAsiaTheme="majorEastAsia" w:hAnsiTheme="majorHAnsi" w:cstheme="majorBidi" w:ascii="Microsoft JhengHei" w:hAnsi="Microsoft JhengHei" w:eastAsia="Microsoft JhengHei"/>
+      <w:rFonts w:asciiTheme="majorHAnsi" w:eastAsiaTheme="majorEastAsia" w:hAnsiTheme="majorHAnsi" w:cstheme="majorBidi"/>
       <w:color w:val="17365D" w:themeColor="text2" w:themeShade="BF"/>
       <w:spacing w:val="5"/>
       <w:kern w:val="28"/>

</xml_diff>